<commit_message>
feat(sre): complete CloudMind scope, test suite, and dialogue engine
</commit_message>
<xml_diff>
--- a/💡 CloudMind.docx
+++ b/💡 CloudMind.docx
@@ -1,6 +1,6 @@
 
 <file path=word/document.xml><?xml version="1.0" encoding="utf-8"?>
-<w:document xmlns:wpc="http://schemas.microsoft.com/office/word/2010/wordprocessingCanvas" xmlns:cx="http://schemas.microsoft.com/office/drawing/2014/chartex" xmlns:cx1="http://schemas.microsoft.com/office/drawing/2015/9/8/chartex" xmlns:cx2="http://schemas.microsoft.com/office/drawing/2015/10/21/chartex" xmlns:cx3="http://schemas.microsoft.com/office/drawing/2016/5/9/chartex" xmlns:cx4="http://schemas.microsoft.com/office/drawing/2016/5/10/chartex" xmlns:cx5="http://schemas.microsoft.com/office/drawing/2016/5/11/chartex" xmlns:cx6="http://schemas.microsoft.com/office/drawing/2016/5/12/chartex" xmlns:cx7="http://schemas.microsoft.com/office/drawing/2016/5/13/chartex" xmlns:cx8="http://schemas.microsoft.com/office/drawing/2016/5/14/chartex" xmlns:mc="http://schemas.openxmlformats.org/markup-compatibility/2006" xmlns:aink="http://schemas.microsoft.com/office/drawing/2016/ink" xmlns:am3d="http://schemas.microsoft.com/office/drawing/2017/model3d" xmlns:o="urn:schemas-microsoft-com:office:office" xmlns:oel="http://schemas.microsoft.com/office/2019/extlst" xmlns:r="http://schemas.openxmlformats.org/officeDocument/2006/relationships" xmlns:m="http://schemas.openxmlformats.org/officeDocument/2006/math" xmlns:v="urn:schemas-microsoft-com:vml" xmlns:wp14="http://schemas.microsoft.com/office/word/2010/wordprocessingDrawing" xmlns:wp="http://schemas.openxmlformats.org/drawingml/2006/wordprocessingDrawing" xmlns:w10="urn:schemas-microsoft-com:office:word" xmlns:w="http://schemas.openxmlformats.org/wordprocessingml/2006/main" xmlns:w14="http://schemas.microsoft.com/office/word/2010/wordml" xmlns:w15="http://schemas.microsoft.com/office/word/2012/wordml" xmlns:w16cex="http://schemas.microsoft.com/office/word/2018/wordml/cex" xmlns:w16cid="http://schemas.microsoft.com/office/word/2016/wordml/cid" xmlns:w16="http://schemas.microsoft.com/office/word/2018/wordml" xmlns:w16du="http://schemas.microsoft.com/office/word/2023/wordml/word16du" xmlns:w16sdtdh="http://schemas.microsoft.com/office/word/2020/wordml/sdtdatahash" xmlns:w16se="http://schemas.microsoft.com/office/word/2015/wordml/symex" xmlns:wpg="http://schemas.microsoft.com/office/word/2010/wordprocessingGroup" xmlns:wpi="http://schemas.microsoft.com/office/word/2010/wordprocessingInk" xmlns:wne="http://schemas.microsoft.com/office/word/2006/wordml" xmlns:wps="http://schemas.microsoft.com/office/word/2010/wordprocessingShape" mc:Ignorable="w14 w15 w16se w16cid w16 w16cex w16sdtdh w16du wp14">
+<w:document xmlns:wpc="http://schemas.microsoft.com/office/word/2010/wordprocessingCanvas" xmlns:cx="http://schemas.microsoft.com/office/drawing/2014/chartex" xmlns:cx1="http://schemas.microsoft.com/office/drawing/2015/9/8/chartex" xmlns:cx2="http://schemas.microsoft.com/office/drawing/2015/10/21/chartex" xmlns:cx3="http://schemas.microsoft.com/office/drawing/2016/5/9/chartex" xmlns:cx4="http://schemas.microsoft.com/office/drawing/2016/5/10/chartex" xmlns:cx5="http://schemas.microsoft.com/office/drawing/2016/5/11/chartex" xmlns:cx6="http://schemas.microsoft.com/office/drawing/2016/5/12/chartex" xmlns:cx7="http://schemas.microsoft.com/office/drawing/2016/5/13/chartex" xmlns:cx8="http://schemas.microsoft.com/office/drawing/2016/5/14/chartex" xmlns:mc="http://schemas.openxmlformats.org/markup-compatibility/2006" xmlns:aink="http://schemas.microsoft.com/office/drawing/2016/ink" xmlns:am3d="http://schemas.microsoft.com/office/drawing/2017/model3d" xmlns:o="urn:schemas-microsoft-com:office:office" xmlns:oel="http://schemas.microsoft.com/office/2019/extlst" xmlns:r="http://schemas.openxmlformats.org/officeDocument/2006/relationships" xmlns:m="http://schemas.openxmlformats.org/officeDocument/2006/math" xmlns:v="urn:schemas-microsoft-com:vml" xmlns:wp14="http://schemas.microsoft.com/office/word/2010/wordprocessingDrawing" xmlns:wp="http://schemas.openxmlformats.org/drawingml/2006/wordprocessingDrawing" xmlns:w10="urn:schemas-microsoft-com:office:word" xmlns:w="http://schemas.openxmlformats.org/wordprocessingml/2006/main" xmlns:w14="http://schemas.microsoft.com/office/word/2010/wordml" xmlns:w15="http://schemas.microsoft.com/office/word/2012/wordml" xmlns:w16cex="http://schemas.microsoft.com/office/word/2018/wordml/cex" xmlns:w16cid="http://schemas.microsoft.com/office/word/2016/wordml/cid" xmlns:w16="http://schemas.microsoft.com/office/word/2018/wordml" xmlns:w16du="http://schemas.microsoft.com/office/word/2023/wordml/word16du" xmlns:w16sdtdh="http://schemas.microsoft.com/office/word/2020/wordml/sdtdatahash" xmlns:w16sdtfl="http://schemas.microsoft.com/office/word/2024/wordml/sdtformatlock" xmlns:w16se="http://schemas.microsoft.com/office/word/2015/wordml/symex" xmlns:wpg="http://schemas.microsoft.com/office/word/2010/wordprocessingGroup" xmlns:wpi="http://schemas.microsoft.com/office/word/2010/wordprocessingInk" xmlns:wne="http://schemas.microsoft.com/office/word/2006/wordml" xmlns:wps="http://schemas.microsoft.com/office/word/2010/wordprocessingShape" mc:Ignorable="w14 w15 w16se w16cid w16 w16cex w16sdtdh w16sdtfl w16du wp14">
   <w:body>
     <w:p>
       <w:pPr>
@@ -248,7 +248,7 @@
           <w:rFonts w:ascii="Times New Roman" w:hAnsi="Times New Roman" w:cs="Times New Roman"/>
           <w:noProof/>
         </w:rPr>
-        <w:pict w14:anchorId="0FA57181">
+        <w:pict w14:anchorId="3E7953C8">
           <v:rect id="_x0000_i1030" alt="" style="width:468pt;height:.05pt;mso-width-percent:0;mso-height-percent:0;mso-width-percent:0;mso-height-percent:0" o:hralign="center" o:hrstd="t" o:hr="t" fillcolor="#a0a0a0" stroked="f"/>
         </w:pict>
       </w:r>
@@ -381,7 +381,7 @@
           <w:rFonts w:ascii="Times New Roman" w:hAnsi="Times New Roman" w:cs="Times New Roman"/>
           <w:noProof/>
         </w:rPr>
-        <w:pict w14:anchorId="5900193C">
+        <w:pict w14:anchorId="012AF2E0">
           <v:rect id="_x0000_i1029" alt="" style="width:468pt;height:.05pt;mso-width-percent:0;mso-height-percent:0;mso-width-percent:0;mso-height-percent:0" o:hralign="center" o:hrstd="t" o:hr="t" fillcolor="#a0a0a0" stroked="f"/>
         </w:pict>
       </w:r>
@@ -856,7 +856,7 @@
           <w:rFonts w:ascii="Times New Roman" w:hAnsi="Times New Roman" w:cs="Times New Roman"/>
           <w:noProof/>
         </w:rPr>
-        <w:pict w14:anchorId="73D4F58D">
+        <w:pict w14:anchorId="51459844">
           <v:rect id="_x0000_i1028" alt="" style="width:468pt;height:.05pt;mso-width-percent:0;mso-height-percent:0;mso-width-percent:0;mso-height-percent:0" o:hralign="center" o:hrstd="t" o:hr="t" fillcolor="#a0a0a0" stroked="f"/>
         </w:pict>
       </w:r>
@@ -1049,7 +1049,7 @@
           <w:bCs/>
           <w:noProof/>
         </w:rPr>
-        <w:pict w14:anchorId="5337F0D0">
+        <w:pict w14:anchorId="2F675249">
           <v:rect id="_x0000_i1027" alt="" style="width:468pt;height:.05pt;mso-width-percent:0;mso-height-percent:0;mso-width-percent:0;mso-height-percent:0" o:hralign="center" o:hrstd="t" o:hr="t" fillcolor="#a0a0a0" stroked="f"/>
         </w:pict>
       </w:r>
@@ -1340,7 +1340,7 @@
           <w:bCs/>
           <w:noProof/>
         </w:rPr>
-        <w:pict w14:anchorId="241E3853">
+        <w:pict w14:anchorId="41F50D1A">
           <v:rect id="_x0000_i1026" alt="" style="width:468pt;height:.05pt;mso-width-percent:0;mso-height-percent:0;mso-width-percent:0;mso-height-percent:0" o:hralign="center" o:hrstd="t" o:hr="t" fillcolor="#a0a0a0" stroked="f"/>
         </w:pict>
       </w:r>
@@ -1508,7 +1508,7 @@
           <w:bCs/>
           <w:noProof/>
         </w:rPr>
-        <w:pict w14:anchorId="36639D0C">
+        <w:pict w14:anchorId="5577C5B3">
           <v:rect id="_x0000_i1025" alt="" style="width:468pt;height:.05pt;mso-width-percent:0;mso-height-percent:0;mso-width-percent:0;mso-height-percent:0" o:hralign="center" o:hrstd="t" o:hr="t" fillcolor="#a0a0a0" stroked="f"/>
         </w:pict>
       </w:r>
@@ -2099,17 +2099,84 @@
         </w:rPr>
       </w:pPr>
     </w:p>
-    <w:p>
-      <w:pPr>
-        <w:pStyle w:val="Heading1"/>
-      </w:pPr>
-      <w:r>
-        <w:t>🚀 Antigravity's Tweaks &amp; Solo SRE Roadmap (Leveling Up)</w:t>
-      </w:r>
-    </w:p>
-    <w:p>
-      <w:r>
-        <w:t>To transform CloudMind from a fun hackathon concept into an industry-grade portfolio showcase for DevOps, Cloud, SRE, and Observability roles, we are implementing the following premium tweaks. Since we are building this solo, these upgrades will demonstrate systems thinking, automation, and AI integration that far exceeds typical junior-level projects.</w:t>
+    <w:p/>
+    <w:p>
+      <w:pPr>
+        <w:sectPr>
+          <w:pgSz w:w="12240" w:h="15840"/>
+          <w:pgMar w:top="1440" w:right="1440" w:bottom="1440" w:left="1440" w:header="708" w:footer="708" w:gutter="0"/>
+          <w:cols w:space="708"/>
+          <w:docGrid w:linePitch="360"/>
+        </w:sectPr>
+      </w:pPr>
+    </w:p>
+    <w:p>
+      <w:pPr>
+        <w:jc w:val="center"/>
+      </w:pPr>
+      <w:r>
+        <w:rPr>
+          <w:b/>
+          <w:color w:val="2E74B5"/>
+          <w:sz w:val="40"/>
+        </w:rPr>
+        <w:t>CloudMind Completion Plan</w:t>
+      </w:r>
+    </w:p>
+    <w:p>
+      <w:pPr>
+        <w:jc w:val="center"/>
+      </w:pPr>
+      <w:r>
+        <w:rPr>
+          <w:i/>
+          <w:sz w:val="22"/>
+        </w:rPr>
+        <w:t>Reviewer findings, remaining work, and execution roadmap</w:t>
+      </w:r>
+    </w:p>
+    <w:tbl>
+      <w:tblPr>
+        <w:tblW w:type="auto" w:w="0"/>
+        <w:tblLook w:firstColumn="1" w:firstRow="1" w:lastColumn="0" w:lastRow="0" w:noHBand="0" w:noVBand="1" w:val="04A0"/>
+      </w:tblPr>
+      <w:tblGrid>
+        <w:gridCol w:w="9360"/>
+      </w:tblGrid>
+      <w:tr>
+        <w:tc>
+          <w:tcPr>
+            <w:tcW w:type="dxa" w:w="9360"/>
+            <w:shd w:fill="FFF2CC"/>
+          </w:tcPr>
+          <w:p>
+            <w:pPr>
+              <w:spacing w:after="0"/>
+            </w:pPr>
+            <w:r/>
+            <w:r>
+              <w:rPr>
+                <w:b/>
+                <w:color w:val="7A5A00"/>
+              </w:rPr>
+              <w:t xml:space="preserve">Mira's honest reviewer note: </w:t>
+            </w:r>
+            <w:r>
+              <w:t>CloudMind is already a strong local demo. The next stage is not adding more flashy features; it is making the promised behavior repeatable, testable, and documented without exaggeration.</w:t>
+            </w:r>
+          </w:p>
+        </w:tc>
+      </w:tr>
+    </w:tbl>
+    <w:p>
+      <w:r>
+        <w:rPr>
+          <w:b/>
+        </w:rPr>
+        <w:t xml:space="preserve">Current verdict: </w:t>
+      </w:r>
+      <w:r>
+        <w:t>CloudMind works as a local Docker-based SRE observability and auto-remediation demo. It is not yet complete against the original 24-hour project plan because tests, CI/CD, deployment, some promised APIs, and the planned frontend/AI separation are still missing.</w:t>
       </w:r>
     </w:p>
     <w:p>
@@ -2117,38 +2184,1591 @@
         <w:pStyle w:val="Heading2"/>
       </w:pPr>
       <w:r>
-        <w:t>1. The Chaos Engine (Real Failure Injection)</w:t>
-      </w:r>
-    </w:p>
-    <w:p>
-      <w:r>
-        <w:t>Instead of randomly simulating CPU load and latency, we will add a /stress endpoint to each microservice. When triggered, this launches real CPU-intensive workloads (using Python threading) or artificial delays. This allows us to test the resilience of our system under real stress, showing a genuine understanding of Chaos Engineering.</w:t>
-      </w:r>
-    </w:p>
+        <w:rPr>
+          <w:rFonts w:ascii="Calibri" w:hAnsi="Calibri"/>
+          <w:color w:val="2E74B5"/>
+        </w:rPr>
+        <w:t>Reviewer Completion Matrix</w:t>
+      </w:r>
+    </w:p>
+    <w:tbl>
+      <w:tblPr>
+        <w:tblW w:type="auto" w:w="0"/>
+        <w:tblLayout w:type="fixed"/>
+        <w:tblLook w:firstColumn="1" w:firstRow="1" w:lastColumn="0" w:lastRow="0" w:noHBand="0" w:noVBand="1" w:val="04A0"/>
+      </w:tblPr>
+      <w:tblGrid>
+        <w:gridCol w:w="3120"/>
+        <w:gridCol w:w="3120"/>
+        <w:gridCol w:w="3120"/>
+      </w:tblGrid>
+      <w:tr>
+        <w:tc>
+          <w:tcPr>
+            <w:tcW w:type="dxa" w:w="2088"/>
+            <w:shd w:fill="D9EAF7"/>
+          </w:tcPr>
+          <w:p>
+            <w:pPr>
+              <w:spacing w:after="40"/>
+            </w:pPr>
+            <w:r>
+              <w:rPr>
+                <w:b/>
+                <w:color w:val="1F4D78"/>
+              </w:rPr>
+            </w:r>
+            <w:r>
+              <w:rPr>
+                <w:rFonts w:ascii="Calibri" w:hAnsi="Calibri"/>
+                <w:b/>
+                <w:color w:val="1F4D78"/>
+                <w:sz w:val="18"/>
+              </w:rPr>
+              <w:t>Area</w:t>
+            </w:r>
+          </w:p>
+        </w:tc>
+        <w:tc>
+          <w:tcPr>
+            <w:tcW w:type="dxa" w:w="5472"/>
+            <w:shd w:fill="D9EAF7"/>
+          </w:tcPr>
+          <w:p>
+            <w:pPr>
+              <w:spacing w:after="40"/>
+            </w:pPr>
+            <w:r>
+              <w:rPr>
+                <w:b/>
+                <w:color w:val="1F4D78"/>
+              </w:rPr>
+            </w:r>
+            <w:r>
+              <w:rPr>
+                <w:rFonts w:ascii="Calibri" w:hAnsi="Calibri"/>
+                <w:b/>
+                <w:color w:val="1F4D78"/>
+                <w:sz w:val="18"/>
+              </w:rPr>
+              <w:t>Current Status</w:t>
+            </w:r>
+          </w:p>
+        </w:tc>
+        <w:tc>
+          <w:tcPr>
+            <w:tcW w:type="dxa" w:w="1800"/>
+            <w:shd w:fill="D9EAF7"/>
+          </w:tcPr>
+          <w:p>
+            <w:pPr>
+              <w:spacing w:after="40"/>
+            </w:pPr>
+            <w:r>
+              <w:rPr>
+                <w:b/>
+                <w:color w:val="1F4D78"/>
+              </w:rPr>
+            </w:r>
+            <w:r>
+              <w:rPr>
+                <w:rFonts w:ascii="Calibri" w:hAnsi="Calibri"/>
+                <w:b/>
+                <w:color w:val="1F4D78"/>
+                <w:sz w:val="18"/>
+              </w:rPr>
+              <w:t>Verdict</w:t>
+            </w:r>
+          </w:p>
+        </w:tc>
+      </w:tr>
+      <w:tr>
+        <w:tc>
+          <w:tcPr>
+            <w:tcW w:type="dxa" w:w="2088"/>
+          </w:tcPr>
+          <w:p>
+            <w:pPr>
+              <w:spacing w:after="40"/>
+            </w:pPr>
+            <w:r/>
+            <w:r>
+              <w:rPr>
+                <w:rFonts w:ascii="Calibri" w:hAnsi="Calibri"/>
+                <w:b w:val="0"/>
+                <w:sz w:val="18"/>
+              </w:rPr>
+              <w:t>Core idea</w:t>
+            </w:r>
+          </w:p>
+        </w:tc>
+        <w:tc>
+          <w:tcPr>
+            <w:tcW w:type="dxa" w:w="5472"/>
+          </w:tcPr>
+          <w:p>
+            <w:pPr>
+              <w:spacing w:after="40"/>
+            </w:pPr>
+            <w:r/>
+            <w:r>
+              <w:rPr>
+                <w:rFonts w:ascii="Calibri" w:hAnsi="Calibri"/>
+                <w:b w:val="0"/>
+                <w:sz w:val="18"/>
+              </w:rPr>
+              <w:t>Emotional observability concept is implemented as a working local demo.</w:t>
+            </w:r>
+          </w:p>
+        </w:tc>
+        <w:tc>
+          <w:tcPr>
+            <w:tcW w:type="dxa" w:w="1800"/>
+          </w:tcPr>
+          <w:p>
+            <w:pPr>
+              <w:spacing w:after="40"/>
+            </w:pPr>
+            <w:r/>
+            <w:r>
+              <w:rPr>
+                <w:rFonts w:ascii="Calibri" w:hAnsi="Calibri"/>
+                <w:b w:val="0"/>
+                <w:sz w:val="18"/>
+              </w:rPr>
+              <w:t>Mostly done</w:t>
+            </w:r>
+          </w:p>
+        </w:tc>
+      </w:tr>
+      <w:tr>
+        <w:tc>
+          <w:tcPr>
+            <w:tcW w:type="dxa" w:w="2088"/>
+          </w:tcPr>
+          <w:p>
+            <w:pPr>
+              <w:spacing w:after="40"/>
+            </w:pPr>
+            <w:r/>
+            <w:r>
+              <w:rPr>
+                <w:rFonts w:ascii="Calibri" w:hAnsi="Calibri"/>
+                <w:b w:val="0"/>
+                <w:sz w:val="18"/>
+              </w:rPr>
+              <w:t>Five services</w:t>
+            </w:r>
+          </w:p>
+        </w:tc>
+        <w:tc>
+          <w:tcPr>
+            <w:tcW w:type="dxa" w:w="5472"/>
+          </w:tcPr>
+          <w:p>
+            <w:pPr>
+              <w:spacing w:after="40"/>
+            </w:pPr>
+            <w:r/>
+            <w:r>
+              <w:rPr>
+                <w:rFonts w:ascii="Calibri" w:hAnsi="Calibri"/>
+                <w:b w:val="0"/>
+                <w:sz w:val="18"/>
+              </w:rPr>
+              <w:t>Frontend, API, Database, Cache, and Auth run as Flask containers on ports 5050-5054.</w:t>
+            </w:r>
+          </w:p>
+        </w:tc>
+        <w:tc>
+          <w:tcPr>
+            <w:tcW w:type="dxa" w:w="1800"/>
+          </w:tcPr>
+          <w:p>
+            <w:pPr>
+              <w:spacing w:after="40"/>
+            </w:pPr>
+            <w:r/>
+            <w:r>
+              <w:rPr>
+                <w:rFonts w:ascii="Calibri" w:hAnsi="Calibri"/>
+                <w:b w:val="0"/>
+                <w:sz w:val="18"/>
+              </w:rPr>
+              <w:t>Done</w:t>
+            </w:r>
+          </w:p>
+        </w:tc>
+      </w:tr>
+      <w:tr>
+        <w:tc>
+          <w:tcPr>
+            <w:tcW w:type="dxa" w:w="2088"/>
+          </w:tcPr>
+          <w:p>
+            <w:pPr>
+              <w:spacing w:after="40"/>
+            </w:pPr>
+            <w:r/>
+            <w:r>
+              <w:rPr>
+                <w:rFonts w:ascii="Calibri" w:hAnsi="Calibri"/>
+                <w:b w:val="0"/>
+                <w:sz w:val="18"/>
+              </w:rPr>
+              <w:t>Health APIs</w:t>
+            </w:r>
+          </w:p>
+        </w:tc>
+        <w:tc>
+          <w:tcPr>
+            <w:tcW w:type="dxa" w:w="5472"/>
+          </w:tcPr>
+          <w:p>
+            <w:pPr>
+              <w:spacing w:after="40"/>
+            </w:pPr>
+            <w:r/>
+            <w:r>
+              <w:rPr>
+                <w:rFonts w:ascii="Calibri" w:hAnsi="Calibri"/>
+                <w:b w:val="0"/>
+                <w:sz w:val="18"/>
+              </w:rPr>
+              <w:t>/status, /metrics, /stress, and /heal exist. DOCX-planned /load and /incident are missing.</w:t>
+            </w:r>
+          </w:p>
+        </w:tc>
+        <w:tc>
+          <w:tcPr>
+            <w:tcW w:type="dxa" w:w="1800"/>
+          </w:tcPr>
+          <w:p>
+            <w:pPr>
+              <w:spacing w:after="40"/>
+            </w:pPr>
+            <w:r/>
+            <w:r>
+              <w:rPr>
+                <w:rFonts w:ascii="Calibri" w:hAnsi="Calibri"/>
+                <w:b w:val="0"/>
+                <w:sz w:val="18"/>
+              </w:rPr>
+              <w:t>Partial</w:t>
+            </w:r>
+          </w:p>
+        </w:tc>
+      </w:tr>
+      <w:tr>
+        <w:tc>
+          <w:tcPr>
+            <w:tcW w:type="dxa" w:w="2088"/>
+          </w:tcPr>
+          <w:p>
+            <w:pPr>
+              <w:spacing w:after="40"/>
+            </w:pPr>
+            <w:r/>
+            <w:r>
+              <w:rPr>
+                <w:rFonts w:ascii="Calibri" w:hAnsi="Calibri"/>
+                <w:b w:val="0"/>
+                <w:sz w:val="18"/>
+              </w:rPr>
+              <w:t>Prometheus</w:t>
+            </w:r>
+          </w:p>
+        </w:tc>
+        <w:tc>
+          <w:tcPr>
+            <w:tcW w:type="dxa" w:w="5472"/>
+          </w:tcPr>
+          <w:p>
+            <w:pPr>
+              <w:spacing w:after="40"/>
+            </w:pPr>
+            <w:r/>
+            <w:r>
+              <w:rPr>
+                <w:rFonts w:ascii="Calibri" w:hAnsi="Calibri"/>
+                <w:b w:val="0"/>
+                <w:sz w:val="18"/>
+              </w:rPr>
+              <w:t>All five service targets scrape successfully and expose service CPU/latency metrics.</w:t>
+            </w:r>
+          </w:p>
+        </w:tc>
+        <w:tc>
+          <w:tcPr>
+            <w:tcW w:type="dxa" w:w="1800"/>
+          </w:tcPr>
+          <w:p>
+            <w:pPr>
+              <w:spacing w:after="40"/>
+            </w:pPr>
+            <w:r/>
+            <w:r>
+              <w:rPr>
+                <w:rFonts w:ascii="Calibri" w:hAnsi="Calibri"/>
+                <w:b w:val="0"/>
+                <w:sz w:val="18"/>
+              </w:rPr>
+              <w:t>Done</w:t>
+            </w:r>
+          </w:p>
+        </w:tc>
+      </w:tr>
+      <w:tr>
+        <w:tc>
+          <w:tcPr>
+            <w:tcW w:type="dxa" w:w="2088"/>
+          </w:tcPr>
+          <w:p>
+            <w:pPr>
+              <w:spacing w:after="40"/>
+            </w:pPr>
+            <w:r/>
+            <w:r>
+              <w:rPr>
+                <w:rFonts w:ascii="Calibri" w:hAnsi="Calibri"/>
+                <w:b w:val="0"/>
+                <w:sz w:val="18"/>
+              </w:rPr>
+              <w:t>Grafana</w:t>
+            </w:r>
+          </w:p>
+        </w:tc>
+        <w:tc>
+          <w:tcPr>
+            <w:tcW w:type="dxa" w:w="5472"/>
+          </w:tcPr>
+          <w:p>
+            <w:pPr>
+              <w:spacing w:after="40"/>
+            </w:pPr>
+            <w:r/>
+            <w:r>
+              <w:rPr>
+                <w:rFonts w:ascii="Calibri" w:hAnsi="Calibri"/>
+                <w:b w:val="0"/>
+                <w:sz w:val="18"/>
+              </w:rPr>
+              <w:t>Provisioned dashboard exists for CPU, latency, and request rate.</w:t>
+            </w:r>
+          </w:p>
+        </w:tc>
+        <w:tc>
+          <w:tcPr>
+            <w:tcW w:type="dxa" w:w="1800"/>
+          </w:tcPr>
+          <w:p>
+            <w:pPr>
+              <w:spacing w:after="40"/>
+            </w:pPr>
+            <w:r/>
+            <w:r>
+              <w:rPr>
+                <w:rFonts w:ascii="Calibri" w:hAnsi="Calibri"/>
+                <w:b w:val="0"/>
+                <w:sz w:val="18"/>
+              </w:rPr>
+              <w:t>Done</w:t>
+            </w:r>
+          </w:p>
+        </w:tc>
+      </w:tr>
+      <w:tr>
+        <w:tc>
+          <w:tcPr>
+            <w:tcW w:type="dxa" w:w="2088"/>
+          </w:tcPr>
+          <w:p>
+            <w:pPr>
+              <w:spacing w:after="40"/>
+            </w:pPr>
+            <w:r/>
+            <w:r>
+              <w:rPr>
+                <w:rFonts w:ascii="Calibri" w:hAnsi="Calibri"/>
+                <w:b w:val="0"/>
+                <w:sz w:val="18"/>
+              </w:rPr>
+              <w:t>Dialogue engine</w:t>
+            </w:r>
+          </w:p>
+        </w:tc>
+        <w:tc>
+          <w:tcPr>
+            <w:tcW w:type="dxa" w:w="5472"/>
+          </w:tcPr>
+          <w:p>
+            <w:pPr>
+              <w:spacing w:after="40"/>
+            </w:pPr>
+            <w:r/>
+            <w:r>
+              <w:rPr>
+                <w:rFonts w:ascii="Calibri" w:hAnsi="Calibri"/>
+                <w:b w:val="0"/>
+                <w:sz w:val="18"/>
+              </w:rPr>
+              <w:t>Local fallback dialogue works. Gemini code exists but runtime test fell back to local scripts.</w:t>
+            </w:r>
+          </w:p>
+        </w:tc>
+        <w:tc>
+          <w:tcPr>
+            <w:tcW w:type="dxa" w:w="1800"/>
+          </w:tcPr>
+          <w:p>
+            <w:pPr>
+              <w:spacing w:after="40"/>
+            </w:pPr>
+            <w:r/>
+            <w:r>
+              <w:rPr>
+                <w:rFonts w:ascii="Calibri" w:hAnsi="Calibri"/>
+                <w:b w:val="0"/>
+                <w:sz w:val="18"/>
+              </w:rPr>
+              <w:t>Partial</w:t>
+            </w:r>
+          </w:p>
+        </w:tc>
+      </w:tr>
+      <w:tr>
+        <w:tc>
+          <w:tcPr>
+            <w:tcW w:type="dxa" w:w="2088"/>
+          </w:tcPr>
+          <w:p>
+            <w:pPr>
+              <w:spacing w:after="40"/>
+            </w:pPr>
+            <w:r/>
+            <w:r>
+              <w:rPr>
+                <w:rFonts w:ascii="Calibri" w:hAnsi="Calibri"/>
+                <w:b w:val="0"/>
+                <w:sz w:val="18"/>
+              </w:rPr>
+              <w:t>Auto-healing</w:t>
+            </w:r>
+          </w:p>
+        </w:tc>
+        <w:tc>
+          <w:tcPr>
+            <w:tcW w:type="dxa" w:w="5472"/>
+          </w:tcPr>
+          <w:p>
+            <w:pPr>
+              <w:spacing w:after="40"/>
+            </w:pPr>
+            <w:r/>
+            <w:r>
+              <w:rPr>
+                <w:rFonts w:ascii="Calibri" w:hAnsi="Calibri"/>
+                <w:b w:val="0"/>
+                <w:sz w:val="18"/>
+              </w:rPr>
+              <w:t>InfraMirror restarts a stressed container after CPU crosses the hard threshold.</w:t>
+            </w:r>
+          </w:p>
+        </w:tc>
+        <w:tc>
+          <w:tcPr>
+            <w:tcW w:type="dxa" w:w="1800"/>
+          </w:tcPr>
+          <w:p>
+            <w:pPr>
+              <w:spacing w:after="40"/>
+            </w:pPr>
+            <w:r/>
+            <w:r>
+              <w:rPr>
+                <w:rFonts w:ascii="Calibri" w:hAnsi="Calibri"/>
+                <w:b w:val="0"/>
+                <w:sz w:val="18"/>
+              </w:rPr>
+              <w:t>Working demo</w:t>
+            </w:r>
+          </w:p>
+        </w:tc>
+      </w:tr>
+      <w:tr>
+        <w:tc>
+          <w:tcPr>
+            <w:tcW w:type="dxa" w:w="2088"/>
+          </w:tcPr>
+          <w:p>
+            <w:pPr>
+              <w:spacing w:after="40"/>
+            </w:pPr>
+            <w:r/>
+            <w:r>
+              <w:rPr>
+                <w:rFonts w:ascii="Calibri" w:hAnsi="Calibri"/>
+                <w:b w:val="0"/>
+                <w:sz w:val="18"/>
+              </w:rPr>
+              <w:t>Frontend</w:t>
+            </w:r>
+          </w:p>
+        </w:tc>
+        <w:tc>
+          <w:tcPr>
+            <w:tcW w:type="dxa" w:w="5472"/>
+          </w:tcPr>
+          <w:p>
+            <w:pPr>
+              <w:spacing w:after="40"/>
+            </w:pPr>
+            <w:r/>
+            <w:r>
+              <w:rPr>
+                <w:rFonts w:ascii="Calibri" w:hAnsi="Calibri"/>
+                <w:b w:val="0"/>
+                <w:sz w:val="18"/>
+              </w:rPr>
+              <w:t>Dashboard is served and polls status/dialogues. It is not React, Tailwind, Framer Motion, or WebSocket based.</w:t>
+            </w:r>
+          </w:p>
+        </w:tc>
+        <w:tc>
+          <w:tcPr>
+            <w:tcW w:type="dxa" w:w="1800"/>
+          </w:tcPr>
+          <w:p>
+            <w:pPr>
+              <w:spacing w:after="40"/>
+            </w:pPr>
+            <w:r/>
+            <w:r>
+              <w:rPr>
+                <w:rFonts w:ascii="Calibri" w:hAnsi="Calibri"/>
+                <w:b w:val="0"/>
+                <w:sz w:val="18"/>
+              </w:rPr>
+              <w:t>Partial</w:t>
+            </w:r>
+          </w:p>
+        </w:tc>
+      </w:tr>
+      <w:tr>
+        <w:tc>
+          <w:tcPr>
+            <w:tcW w:type="dxa" w:w="2088"/>
+          </w:tcPr>
+          <w:p>
+            <w:pPr>
+              <w:spacing w:after="40"/>
+            </w:pPr>
+            <w:r/>
+            <w:r>
+              <w:rPr>
+                <w:rFonts w:ascii="Calibri" w:hAnsi="Calibri"/>
+                <w:b w:val="0"/>
+                <w:sz w:val="18"/>
+              </w:rPr>
+              <w:t>CI/CD and deploy</w:t>
+            </w:r>
+          </w:p>
+        </w:tc>
+        <w:tc>
+          <w:tcPr>
+            <w:tcW w:type="dxa" w:w="5472"/>
+          </w:tcPr>
+          <w:p>
+            <w:pPr>
+              <w:spacing w:after="40"/>
+            </w:pPr>
+            <w:r/>
+            <w:r>
+              <w:rPr>
+                <w:rFonts w:ascii="Calibri" w:hAnsi="Calibri"/>
+                <w:b w:val="0"/>
+                <w:sz w:val="18"/>
+              </w:rPr>
+              <w:t>No GitHub Actions, Minikube, AWS Free Tier deployment, or deployment manifests found.</w:t>
+            </w:r>
+          </w:p>
+        </w:tc>
+        <w:tc>
+          <w:tcPr>
+            <w:tcW w:type="dxa" w:w="1800"/>
+          </w:tcPr>
+          <w:p>
+            <w:pPr>
+              <w:spacing w:after="40"/>
+            </w:pPr>
+            <w:r/>
+            <w:r>
+              <w:rPr>
+                <w:rFonts w:ascii="Calibri" w:hAnsi="Calibri"/>
+                <w:b w:val="0"/>
+                <w:sz w:val="18"/>
+              </w:rPr>
+              <w:t>Missing</w:t>
+            </w:r>
+          </w:p>
+        </w:tc>
+      </w:tr>
+      <w:tr>
+        <w:tc>
+          <w:tcPr>
+            <w:tcW w:type="dxa" w:w="2088"/>
+          </w:tcPr>
+          <w:p>
+            <w:pPr>
+              <w:spacing w:after="40"/>
+            </w:pPr>
+            <w:r/>
+            <w:r>
+              <w:rPr>
+                <w:rFonts w:ascii="Calibri" w:hAnsi="Calibri"/>
+                <w:b w:val="0"/>
+                <w:sz w:val="18"/>
+              </w:rPr>
+              <w:t>Tests</w:t>
+            </w:r>
+          </w:p>
+        </w:tc>
+        <w:tc>
+          <w:tcPr>
+            <w:tcW w:type="dxa" w:w="5472"/>
+          </w:tcPr>
+          <w:p>
+            <w:pPr>
+              <w:spacing w:after="40"/>
+            </w:pPr>
+            <w:r/>
+            <w:r>
+              <w:rPr>
+                <w:rFonts w:ascii="Calibri" w:hAnsi="Calibri"/>
+                <w:b w:val="0"/>
+                <w:sz w:val="18"/>
+              </w:rPr>
+              <w:t>No automated unit/integration tests found.</w:t>
+            </w:r>
+          </w:p>
+        </w:tc>
+        <w:tc>
+          <w:tcPr>
+            <w:tcW w:type="dxa" w:w="1800"/>
+          </w:tcPr>
+          <w:p>
+            <w:pPr>
+              <w:spacing w:after="40"/>
+            </w:pPr>
+            <w:r/>
+            <w:r>
+              <w:rPr>
+                <w:rFonts w:ascii="Calibri" w:hAnsi="Calibri"/>
+                <w:b w:val="0"/>
+                <w:sz w:val="18"/>
+              </w:rPr>
+              <w:t>Missing</w:t>
+            </w:r>
+          </w:p>
+        </w:tc>
+      </w:tr>
+      <w:tr>
+        <w:tc>
+          <w:tcPr>
+            <w:tcW w:type="dxa" w:w="2088"/>
+          </w:tcPr>
+          <w:p>
+            <w:pPr>
+              <w:spacing w:after="40"/>
+            </w:pPr>
+            <w:r/>
+            <w:r>
+              <w:rPr>
+                <w:rFonts w:ascii="Calibri" w:hAnsi="Calibri"/>
+                <w:b w:val="0"/>
+                <w:sz w:val="18"/>
+              </w:rPr>
+              <w:t>Demo assets</w:t>
+            </w:r>
+          </w:p>
+        </w:tc>
+        <w:tc>
+          <w:tcPr>
+            <w:tcW w:type="dxa" w:w="5472"/>
+          </w:tcPr>
+          <w:p>
+            <w:pPr>
+              <w:spacing w:after="40"/>
+            </w:pPr>
+            <w:r/>
+            <w:r>
+              <w:rPr>
+                <w:rFonts w:ascii="Calibri" w:hAnsi="Calibri"/>
+                <w:b w:val="0"/>
+                <w:sz w:val="18"/>
+              </w:rPr>
+              <w:t>README and chaos.sh exist. run_demo.sh, slides, and final demo video are missing.</w:t>
+            </w:r>
+          </w:p>
+        </w:tc>
+        <w:tc>
+          <w:tcPr>
+            <w:tcW w:type="dxa" w:w="1800"/>
+          </w:tcPr>
+          <w:p>
+            <w:pPr>
+              <w:spacing w:after="40"/>
+            </w:pPr>
+            <w:r/>
+            <w:r>
+              <w:rPr>
+                <w:rFonts w:ascii="Calibri" w:hAnsi="Calibri"/>
+                <w:b w:val="0"/>
+                <w:sz w:val="18"/>
+              </w:rPr>
+              <w:t>Partial</w:t>
+            </w:r>
+          </w:p>
+        </w:tc>
+      </w:tr>
+    </w:tbl>
     <w:p>
       <w:pPr>
         <w:pStyle w:val="Heading2"/>
       </w:pPr>
       <w:r>
-        <w:t>2. AI-Driven Dialogue &amp; Discord Webhooks</w:t>
-      </w:r>
-    </w:p>
-    <w:p>
-      <w:r>
-        <w:t>We will connect the watcher (InfraMirror) to a Discord webhook. When a service experiences stress, the system will query Prometheus, analyze the metrics, and use an LLM (or a highly structured prompt parser) to generate character-driven, conversational logs. The services will literally 'chat' and 'argue' in a Discord channel, telling a story about the incident, while InfraMirror acts as the automated SRE to heal them.</w:t>
-      </w:r>
-    </w:p>
+        <w:rPr>
+          <w:rFonts w:ascii="Calibri" w:hAnsi="Calibri"/>
+          <w:color w:val="2E74B5"/>
+        </w:rPr>
+        <w:t>Build Roadmap To Make CloudMind Fully Work</w:t>
+      </w:r>
+    </w:p>
+    <w:tbl>
+      <w:tblPr>
+        <w:tblW w:type="auto" w:w="0"/>
+        <w:tblLayout w:type="fixed"/>
+        <w:tblLook w:firstColumn="1" w:firstRow="1" w:lastColumn="0" w:lastRow="0" w:noHBand="0" w:noVBand="1" w:val="04A0"/>
+      </w:tblPr>
+      <w:tblGrid>
+        <w:gridCol w:w="2340"/>
+        <w:gridCol w:w="2340"/>
+        <w:gridCol w:w="2340"/>
+        <w:gridCol w:w="2340"/>
+      </w:tblGrid>
+      <w:tr>
+        <w:tc>
+          <w:tcPr>
+            <w:tcW w:type="dxa" w:w="1512"/>
+            <w:shd w:fill="D9EAF7"/>
+          </w:tcPr>
+          <w:p>
+            <w:pPr>
+              <w:spacing w:after="40"/>
+            </w:pPr>
+            <w:r>
+              <w:rPr>
+                <w:b/>
+                <w:color w:val="1F4D78"/>
+              </w:rPr>
+            </w:r>
+            <w:r>
+              <w:rPr>
+                <w:rFonts w:ascii="Calibri" w:hAnsi="Calibri"/>
+                <w:b/>
+                <w:color w:val="1F4D78"/>
+                <w:sz w:val="18"/>
+              </w:rPr>
+              <w:t>Phase</w:t>
+            </w:r>
+          </w:p>
+        </w:tc>
+        <w:tc>
+          <w:tcPr>
+            <w:tcW w:type="dxa" w:w="2088"/>
+            <w:shd w:fill="D9EAF7"/>
+          </w:tcPr>
+          <w:p>
+            <w:pPr>
+              <w:spacing w:after="40"/>
+            </w:pPr>
+            <w:r>
+              <w:rPr>
+                <w:b/>
+                <w:color w:val="1F4D78"/>
+              </w:rPr>
+            </w:r>
+            <w:r>
+              <w:rPr>
+                <w:rFonts w:ascii="Calibri" w:hAnsi="Calibri"/>
+                <w:b/>
+                <w:color w:val="1F4D78"/>
+                <w:sz w:val="18"/>
+              </w:rPr>
+              <w:t>Goal</w:t>
+            </w:r>
+          </w:p>
+        </w:tc>
+        <w:tc>
+          <w:tcPr>
+            <w:tcW w:type="dxa" w:w="3816"/>
+            <w:shd w:fill="D9EAF7"/>
+          </w:tcPr>
+          <w:p>
+            <w:pPr>
+              <w:spacing w:after="40"/>
+            </w:pPr>
+            <w:r>
+              <w:rPr>
+                <w:b/>
+                <w:color w:val="1F4D78"/>
+              </w:rPr>
+            </w:r>
+            <w:r>
+              <w:rPr>
+                <w:rFonts w:ascii="Calibri" w:hAnsi="Calibri"/>
+                <w:b/>
+                <w:color w:val="1F4D78"/>
+                <w:sz w:val="18"/>
+              </w:rPr>
+              <w:t>Concrete Work</w:t>
+            </w:r>
+          </w:p>
+        </w:tc>
+        <w:tc>
+          <w:tcPr>
+            <w:tcW w:type="dxa" w:w="1944"/>
+            <w:shd w:fill="D9EAF7"/>
+          </w:tcPr>
+          <w:p>
+            <w:pPr>
+              <w:spacing w:after="40"/>
+            </w:pPr>
+            <w:r>
+              <w:rPr>
+                <w:b/>
+                <w:color w:val="1F4D78"/>
+              </w:rPr>
+            </w:r>
+            <w:r>
+              <w:rPr>
+                <w:rFonts w:ascii="Calibri" w:hAnsi="Calibri"/>
+                <w:b/>
+                <w:color w:val="1F4D78"/>
+                <w:sz w:val="18"/>
+              </w:rPr>
+              <w:t>Acceptance Check</w:t>
+            </w:r>
+          </w:p>
+        </w:tc>
+      </w:tr>
+      <w:tr>
+        <w:tc>
+          <w:tcPr>
+            <w:tcW w:type="dxa" w:w="1512"/>
+          </w:tcPr>
+          <w:p>
+            <w:pPr>
+              <w:spacing w:after="40"/>
+            </w:pPr>
+            <w:r/>
+            <w:r>
+              <w:rPr>
+                <w:rFonts w:ascii="Calibri" w:hAnsi="Calibri"/>
+                <w:b w:val="0"/>
+                <w:sz w:val="18"/>
+              </w:rPr>
+              <w:t>1. Stabilize truth</w:t>
+            </w:r>
+          </w:p>
+        </w:tc>
+        <w:tc>
+          <w:tcPr>
+            <w:tcW w:type="dxa" w:w="2088"/>
+          </w:tcPr>
+          <w:p>
+            <w:pPr>
+              <w:spacing w:after="40"/>
+            </w:pPr>
+            <w:r/>
+            <w:r>
+              <w:rPr>
+                <w:rFonts w:ascii="Calibri" w:hAnsi="Calibri"/>
+                <w:b w:val="0"/>
+                <w:sz w:val="18"/>
+              </w:rPr>
+              <w:t>Make docs and code agree.</w:t>
+            </w:r>
+          </w:p>
+        </w:tc>
+        <w:tc>
+          <w:tcPr>
+            <w:tcW w:type="dxa" w:w="3816"/>
+          </w:tcPr>
+          <w:p>
+            <w:pPr>
+              <w:spacing w:after="40"/>
+            </w:pPr>
+            <w:r/>
+            <w:r>
+              <w:rPr>
+                <w:rFonts w:ascii="Calibri" w:hAnsi="Calibri"/>
+                <w:b w:val="0"/>
+                <w:sz w:val="18"/>
+              </w:rPr>
+              <w:t>Update AGENTS.md and README to reflect Flask ports 5050-5054, or migrate code to FastAPI/Postgres/Redis if that is the real target.</w:t>
+            </w:r>
+          </w:p>
+        </w:tc>
+        <w:tc>
+          <w:tcPr>
+            <w:tcW w:type="dxa" w:w="1944"/>
+          </w:tcPr>
+          <w:p>
+            <w:pPr>
+              <w:spacing w:after="40"/>
+            </w:pPr>
+            <w:r/>
+            <w:r>
+              <w:rPr>
+                <w:rFonts w:ascii="Calibri" w:hAnsi="Calibri"/>
+                <w:b w:val="0"/>
+                <w:sz w:val="18"/>
+              </w:rPr>
+              <w:t>A reviewer can run one command and see the same architecture described everywhere.</w:t>
+            </w:r>
+          </w:p>
+        </w:tc>
+      </w:tr>
+      <w:tr>
+        <w:tc>
+          <w:tcPr>
+            <w:tcW w:type="dxa" w:w="1512"/>
+          </w:tcPr>
+          <w:p>
+            <w:pPr>
+              <w:spacing w:after="40"/>
+            </w:pPr>
+            <w:r/>
+            <w:r>
+              <w:rPr>
+                <w:rFonts w:ascii="Calibri" w:hAnsi="Calibri"/>
+                <w:b w:val="0"/>
+                <w:sz w:val="18"/>
+              </w:rPr>
+              <w:t>2. Add missing service contracts</w:t>
+            </w:r>
+          </w:p>
+        </w:tc>
+        <w:tc>
+          <w:tcPr>
+            <w:tcW w:type="dxa" w:w="2088"/>
+          </w:tcPr>
+          <w:p>
+            <w:pPr>
+              <w:spacing w:after="40"/>
+            </w:pPr>
+            <w:r/>
+            <w:r>
+              <w:rPr>
+                <w:rFonts w:ascii="Calibri" w:hAnsi="Calibri"/>
+                <w:b w:val="0"/>
+                <w:sz w:val="18"/>
+              </w:rPr>
+              <w:t>Finish the API surface promised in the plan.</w:t>
+            </w:r>
+          </w:p>
+        </w:tc>
+        <w:tc>
+          <w:tcPr>
+            <w:tcW w:type="dxa" w:w="3816"/>
+          </w:tcPr>
+          <w:p>
+            <w:pPr>
+              <w:spacing w:after="40"/>
+            </w:pPr>
+            <w:r/>
+            <w:r>
+              <w:rPr>
+                <w:rFonts w:ascii="Calibri" w:hAnsi="Calibri"/>
+                <w:b w:val="0"/>
+                <w:sz w:val="18"/>
+              </w:rPr>
+              <w:t>Add /load and /incident endpoints, normalize /status JSON across services, and document every endpoint.</w:t>
+            </w:r>
+          </w:p>
+        </w:tc>
+        <w:tc>
+          <w:tcPr>
+            <w:tcW w:type="dxa" w:w="1944"/>
+          </w:tcPr>
+          <w:p>
+            <w:pPr>
+              <w:spacing w:after="40"/>
+            </w:pPr>
+            <w:r/>
+            <w:r>
+              <w:rPr>
+                <w:rFonts w:ascii="Calibri" w:hAnsi="Calibri"/>
+                <w:b w:val="0"/>
+                <w:sz w:val="18"/>
+              </w:rPr>
+              <w:t>All services return consistent JSON and pass smoke tests.</w:t>
+            </w:r>
+          </w:p>
+        </w:tc>
+      </w:tr>
+      <w:tr>
+        <w:tc>
+          <w:tcPr>
+            <w:tcW w:type="dxa" w:w="1512"/>
+          </w:tcPr>
+          <w:p>
+            <w:pPr>
+              <w:spacing w:after="40"/>
+            </w:pPr>
+            <w:r/>
+            <w:r>
+              <w:rPr>
+                <w:rFonts w:ascii="Calibri" w:hAnsi="Calibri"/>
+                <w:b w:val="0"/>
+                <w:sz w:val="18"/>
+              </w:rPr>
+              <w:t>3. Make AI dialogue real</w:t>
+            </w:r>
+          </w:p>
+        </w:tc>
+        <w:tc>
+          <w:tcPr>
+            <w:tcW w:type="dxa" w:w="2088"/>
+          </w:tcPr>
+          <w:p>
+            <w:pPr>
+              <w:spacing w:after="40"/>
+            </w:pPr>
+            <w:r/>
+            <w:r>
+              <w:rPr>
+                <w:rFonts w:ascii="Calibri" w:hAnsi="Calibri"/>
+                <w:b w:val="0"/>
+                <w:sz w:val="18"/>
+              </w:rPr>
+              <w:t>Separate AI brain from watcher logic.</w:t>
+            </w:r>
+          </w:p>
+        </w:tc>
+        <w:tc>
+          <w:tcPr>
+            <w:tcW w:type="dxa" w:w="3816"/>
+          </w:tcPr>
+          <w:p>
+            <w:pPr>
+              <w:spacing w:after="40"/>
+            </w:pPr>
+            <w:r/>
+            <w:r>
+              <w:rPr>
+                <w:rFonts w:ascii="Calibri" w:hAnsi="Calibri"/>
+                <w:b w:val="0"/>
+                <w:sz w:val="18"/>
+              </w:rPr>
+              <w:t>Create llm_engine.py and/or /whisper endpoint. Validate Gemini key handling, fallback behavior, and webhook payloads.</w:t>
+            </w:r>
+          </w:p>
+        </w:tc>
+        <w:tc>
+          <w:tcPr>
+            <w:tcW w:type="dxa" w:w="1944"/>
+          </w:tcPr>
+          <w:p>
+            <w:pPr>
+              <w:spacing w:after="40"/>
+            </w:pPr>
+            <w:r/>
+            <w:r>
+              <w:rPr>
+                <w:rFonts w:ascii="Calibri" w:hAnsi="Calibri"/>
+                <w:b w:val="0"/>
+                <w:sz w:val="18"/>
+              </w:rPr>
+              <w:t>With a valid key, logs show Gemini response success; without one, fallback remains clean.</w:t>
+            </w:r>
+          </w:p>
+        </w:tc>
+      </w:tr>
+      <w:tr>
+        <w:tc>
+          <w:tcPr>
+            <w:tcW w:type="dxa" w:w="1512"/>
+          </w:tcPr>
+          <w:p>
+            <w:pPr>
+              <w:spacing w:after="40"/>
+            </w:pPr>
+            <w:r/>
+            <w:r>
+              <w:rPr>
+                <w:rFonts w:ascii="Calibri" w:hAnsi="Calibri"/>
+                <w:b w:val="0"/>
+                <w:sz w:val="18"/>
+              </w:rPr>
+              <w:t>4. Upgrade frontend</w:t>
+            </w:r>
+          </w:p>
+        </w:tc>
+        <w:tc>
+          <w:tcPr>
+            <w:tcW w:type="dxa" w:w="2088"/>
+          </w:tcPr>
+          <w:p>
+            <w:pPr>
+              <w:spacing w:after="40"/>
+            </w:pPr>
+            <w:r/>
+            <w:r>
+              <w:rPr>
+                <w:rFonts w:ascii="Calibri" w:hAnsi="Calibri"/>
+                <w:b w:val="0"/>
+                <w:sz w:val="18"/>
+              </w:rPr>
+              <w:t>Move from good demo UI to planned realtime dashboard.</w:t>
+            </w:r>
+          </w:p>
+        </w:tc>
+        <w:tc>
+          <w:tcPr>
+            <w:tcW w:type="dxa" w:w="3816"/>
+          </w:tcPr>
+          <w:p>
+            <w:pPr>
+              <w:spacing w:after="40"/>
+            </w:pPr>
+            <w:r/>
+            <w:r>
+              <w:rPr>
+                <w:rFonts w:ascii="Calibri" w:hAnsi="Calibri"/>
+                <w:b w:val="0"/>
+                <w:sz w:val="18"/>
+              </w:rPr>
+              <w:t>Either keep Flask UI and document that choice, or build React/Tailwind UI with WebSockets for live status and dialogue feed.</w:t>
+            </w:r>
+          </w:p>
+        </w:tc>
+        <w:tc>
+          <w:tcPr>
+            <w:tcW w:type="dxa" w:w="1944"/>
+          </w:tcPr>
+          <w:p>
+            <w:pPr>
+              <w:spacing w:after="40"/>
+            </w:pPr>
+            <w:r/>
+            <w:r>
+              <w:rPr>
+                <w:rFonts w:ascii="Calibri" w:hAnsi="Calibri"/>
+                <w:b w:val="0"/>
+                <w:sz w:val="18"/>
+              </w:rPr>
+              <w:t>Dashboard updates without page refresh and clearly shows healthy, stressed, healing, and recovered states.</w:t>
+            </w:r>
+          </w:p>
+        </w:tc>
+      </w:tr>
+      <w:tr>
+        <w:tc>
+          <w:tcPr>
+            <w:tcW w:type="dxa" w:w="1512"/>
+          </w:tcPr>
+          <w:p>
+            <w:pPr>
+              <w:spacing w:after="40"/>
+            </w:pPr>
+            <w:r/>
+            <w:r>
+              <w:rPr>
+                <w:rFonts w:ascii="Calibri" w:hAnsi="Calibri"/>
+                <w:b w:val="0"/>
+                <w:sz w:val="18"/>
+              </w:rPr>
+              <w:t>5. Add real tests</w:t>
+            </w:r>
+          </w:p>
+        </w:tc>
+        <w:tc>
+          <w:tcPr>
+            <w:tcW w:type="dxa" w:w="2088"/>
+          </w:tcPr>
+          <w:p>
+            <w:pPr>
+              <w:spacing w:after="40"/>
+            </w:pPr>
+            <w:r/>
+            <w:r>
+              <w:rPr>
+                <w:rFonts w:ascii="Calibri" w:hAnsi="Calibri"/>
+                <w:b w:val="0"/>
+                <w:sz w:val="18"/>
+              </w:rPr>
+              <w:t>Make the project reviewer-safe.</w:t>
+            </w:r>
+          </w:p>
+        </w:tc>
+        <w:tc>
+          <w:tcPr>
+            <w:tcW w:type="dxa" w:w="3816"/>
+          </w:tcPr>
+          <w:p>
+            <w:pPr>
+              <w:spacing w:after="40"/>
+            </w:pPr>
+            <w:r/>
+            <w:r>
+              <w:rPr>
+                <w:rFonts w:ascii="Calibri" w:hAnsi="Calibri"/>
+                <w:b w:val="0"/>
+                <w:sz w:val="18"/>
+              </w:rPr>
+              <w:t>Add pytest smoke tests for endpoints, Prometheus metrics tests, and an integration script for stress -&gt; dialogue -&gt; restart -&gt; recovery.</w:t>
+            </w:r>
+          </w:p>
+        </w:tc>
+        <w:tc>
+          <w:tcPr>
+            <w:tcW w:type="dxa" w:w="1944"/>
+          </w:tcPr>
+          <w:p>
+            <w:pPr>
+              <w:spacing w:after="40"/>
+            </w:pPr>
+            <w:r/>
+            <w:r>
+              <w:rPr>
+                <w:rFonts w:ascii="Calibri" w:hAnsi="Calibri"/>
+                <w:b w:val="0"/>
+                <w:sz w:val="18"/>
+              </w:rPr>
+              <w:t>A single test command verifies the main demo path.</w:t>
+            </w:r>
+          </w:p>
+        </w:tc>
+      </w:tr>
+      <w:tr>
+        <w:tc>
+          <w:tcPr>
+            <w:tcW w:type="dxa" w:w="1512"/>
+          </w:tcPr>
+          <w:p>
+            <w:pPr>
+              <w:spacing w:after="40"/>
+            </w:pPr>
+            <w:r/>
+            <w:r>
+              <w:rPr>
+                <w:rFonts w:ascii="Calibri" w:hAnsi="Calibri"/>
+                <w:b w:val="0"/>
+                <w:sz w:val="18"/>
+              </w:rPr>
+              <w:t>6. Add one-command demo</w:t>
+            </w:r>
+          </w:p>
+        </w:tc>
+        <w:tc>
+          <w:tcPr>
+            <w:tcW w:type="dxa" w:w="2088"/>
+          </w:tcPr>
+          <w:p>
+            <w:pPr>
+              <w:spacing w:after="40"/>
+            </w:pPr>
+            <w:r/>
+            <w:r>
+              <w:rPr>
+                <w:rFonts w:ascii="Calibri" w:hAnsi="Calibri"/>
+                <w:b w:val="0"/>
+                <w:sz w:val="18"/>
+              </w:rPr>
+              <w:t>Make presenting easy.</w:t>
+            </w:r>
+          </w:p>
+        </w:tc>
+        <w:tc>
+          <w:tcPr>
+            <w:tcW w:type="dxa" w:w="3816"/>
+          </w:tcPr>
+          <w:p>
+            <w:pPr>
+              <w:spacing w:after="40"/>
+            </w:pPr>
+            <w:r/>
+            <w:r>
+              <w:rPr>
+                <w:rFonts w:ascii="Calibri" w:hAnsi="Calibri"/>
+                <w:b w:val="0"/>
+                <w:sz w:val="18"/>
+              </w:rPr>
+              <w:t>Create run_demo.sh to build, start, wait for health, open URLs or print links, trigger optional chaos, and show logs.</w:t>
+            </w:r>
+          </w:p>
+        </w:tc>
+        <w:tc>
+          <w:tcPr>
+            <w:tcW w:type="dxa" w:w="1944"/>
+          </w:tcPr>
+          <w:p>
+            <w:pPr>
+              <w:spacing w:after="40"/>
+            </w:pPr>
+            <w:r/>
+            <w:r>
+              <w:rPr>
+                <w:rFonts w:ascii="Calibri" w:hAnsi="Calibri"/>
+                <w:b w:val="0"/>
+                <w:sz w:val="18"/>
+              </w:rPr>
+              <w:t>Fresh machine demo starts reliably with one command after Docker is running.</w:t>
+            </w:r>
+          </w:p>
+        </w:tc>
+      </w:tr>
+      <w:tr>
+        <w:tc>
+          <w:tcPr>
+            <w:tcW w:type="dxa" w:w="1512"/>
+          </w:tcPr>
+          <w:p>
+            <w:pPr>
+              <w:spacing w:after="40"/>
+            </w:pPr>
+            <w:r/>
+            <w:r>
+              <w:rPr>
+                <w:rFonts w:ascii="Calibri" w:hAnsi="Calibri"/>
+                <w:b w:val="0"/>
+                <w:sz w:val="18"/>
+              </w:rPr>
+              <w:t>7. Deployment path</w:t>
+            </w:r>
+          </w:p>
+        </w:tc>
+        <w:tc>
+          <w:tcPr>
+            <w:tcW w:type="dxa" w:w="2088"/>
+          </w:tcPr>
+          <w:p>
+            <w:pPr>
+              <w:spacing w:after="40"/>
+            </w:pPr>
+            <w:r/>
+            <w:r>
+              <w:rPr>
+                <w:rFonts w:ascii="Calibri" w:hAnsi="Calibri"/>
+                <w:b w:val="0"/>
+                <w:sz w:val="18"/>
+              </w:rPr>
+              <w:t>Finish the DevOps promise.</w:t>
+            </w:r>
+          </w:p>
+        </w:tc>
+        <w:tc>
+          <w:tcPr>
+            <w:tcW w:type="dxa" w:w="3816"/>
+          </w:tcPr>
+          <w:p>
+            <w:pPr>
+              <w:spacing w:after="40"/>
+            </w:pPr>
+            <w:r/>
+            <w:r>
+              <w:rPr>
+                <w:rFonts w:ascii="Calibri" w:hAnsi="Calibri"/>
+                <w:b w:val="0"/>
+                <w:sz w:val="18"/>
+              </w:rPr>
+              <w:t>Add GitHub Actions build/test workflow and optional Minikube manifests. AWS can remain stretch unless required.</w:t>
+            </w:r>
+          </w:p>
+        </w:tc>
+        <w:tc>
+          <w:tcPr>
+            <w:tcW w:type="dxa" w:w="1944"/>
+          </w:tcPr>
+          <w:p>
+            <w:pPr>
+              <w:spacing w:after="40"/>
+            </w:pPr>
+            <w:r/>
+            <w:r>
+              <w:rPr>
+                <w:rFonts w:ascii="Calibri" w:hAnsi="Calibri"/>
+                <w:b w:val="0"/>
+                <w:sz w:val="18"/>
+              </w:rPr>
+              <w:t>CI runs tests on push; Minikube deploy docs work locally.</w:t>
+            </w:r>
+          </w:p>
+        </w:tc>
+      </w:tr>
+      <w:tr>
+        <w:tc>
+          <w:tcPr>
+            <w:tcW w:type="dxa" w:w="1512"/>
+          </w:tcPr>
+          <w:p>
+            <w:pPr>
+              <w:spacing w:after="40"/>
+            </w:pPr>
+            <w:r/>
+            <w:r>
+              <w:rPr>
+                <w:rFonts w:ascii="Calibri" w:hAnsi="Calibri"/>
+                <w:b w:val="0"/>
+                <w:sz w:val="18"/>
+              </w:rPr>
+              <w:t>8. Final submission polish</w:t>
+            </w:r>
+          </w:p>
+        </w:tc>
+        <w:tc>
+          <w:tcPr>
+            <w:tcW w:type="dxa" w:w="2088"/>
+          </w:tcPr>
+          <w:p>
+            <w:pPr>
+              <w:spacing w:after="40"/>
+            </w:pPr>
+            <w:r/>
+            <w:r>
+              <w:rPr>
+                <w:rFonts w:ascii="Calibri" w:hAnsi="Calibri"/>
+                <w:b w:val="0"/>
+                <w:sz w:val="18"/>
+              </w:rPr>
+              <w:t>Package the story honestly.</w:t>
+            </w:r>
+          </w:p>
+        </w:tc>
+        <w:tc>
+          <w:tcPr>
+            <w:tcW w:type="dxa" w:w="3816"/>
+          </w:tcPr>
+          <w:p>
+            <w:pPr>
+              <w:spacing w:after="40"/>
+            </w:pPr>
+            <w:r/>
+            <w:r>
+              <w:rPr>
+                <w:rFonts w:ascii="Calibri" w:hAnsi="Calibri"/>
+                <w:b w:val="0"/>
+                <w:sz w:val="18"/>
+              </w:rPr>
+              <w:t>Update README, add architecture diagram, add demo script, create slides/video checklist, and state simulation boundaries.</w:t>
+            </w:r>
+          </w:p>
+        </w:tc>
+        <w:tc>
+          <w:tcPr>
+            <w:tcW w:type="dxa" w:w="1944"/>
+          </w:tcPr>
+          <w:p>
+            <w:pPr>
+              <w:spacing w:after="40"/>
+            </w:pPr>
+            <w:r/>
+            <w:r>
+              <w:rPr>
+                <w:rFonts w:ascii="Calibri" w:hAnsi="Calibri"/>
+                <w:b w:val="0"/>
+                <w:sz w:val="18"/>
+              </w:rPr>
+              <w:t>Submission says 'working local SRE demo' unless production features are truly implemented.</w:t>
+            </w:r>
+          </w:p>
+        </w:tc>
+      </w:tr>
+    </w:tbl>
     <w:p>
       <w:pPr>
         <w:pStyle w:val="Heading2"/>
       </w:pPr>
       <w:r>
-        <w:t>3. The Observability UI Dashboard</w:t>
-      </w:r>
-    </w:p>
-    <w:p>
-      <w:r>
-        <w:t>We will create a stunning, responsive glassmorphic web interface. This UI will visualize the five services as animated 'Emotion Orbs' that shift colors and pulse speeds (Green/Calm, Orange/Anxious, Red/Stressed). It will also feature a Live Event Feed displaying the Discord conversation and interactive sliders to inject chaos (e.g. 'DDoS Frontend', 'Overload DB') instantly.</w:t>
+        <w:rPr>
+          <w:rFonts w:ascii="Calibri" w:hAnsi="Calibri"/>
+          <w:color w:val="2E74B5"/>
+        </w:rPr>
+        <w:t>Definition Of Done</w:t>
+      </w:r>
+    </w:p>
+    <w:p>
+      <w:pPr>
+        <w:spacing w:after="60"/>
+      </w:pPr>
+      <w:r>
+        <w:t>- Docker stack builds from a clean checkout with docker compose up -d --build.</w:t>
+      </w:r>
+    </w:p>
+    <w:p>
+      <w:pPr>
+        <w:spacing w:after="60"/>
+      </w:pPr>
+      <w:r>
+        <w:t>- All five /status endpoints respond with consistent JSON.</w:t>
+      </w:r>
+    </w:p>
+    <w:p>
+      <w:pPr>
+        <w:spacing w:after="60"/>
+      </w:pPr>
+      <w:r>
+        <w:t>- Prometheus target page shows frontend, api, database, cache, and auth as up.</w:t>
+      </w:r>
+    </w:p>
+    <w:p>
+      <w:pPr>
+        <w:spacing w:after="60"/>
+      </w:pPr>
+      <w:r>
+        <w:t>- A stress event creates an incident dialogue within one watcher cycle.</w:t>
+      </w:r>
+    </w:p>
+    <w:p>
+      <w:pPr>
+        <w:spacing w:after="60"/>
+      </w:pPr>
+      <w:r>
+        <w:t>- InfraMirror restarts or heals the affected service and records the event in dialogues.json.</w:t>
+      </w:r>
+    </w:p>
+    <w:p>
+      <w:pPr>
+        <w:spacing w:after="60"/>
+      </w:pPr>
+      <w:r>
+        <w:t>- The dashboard shows healthy, stressed, healing, and recovered states correctly.</w:t>
+      </w:r>
+    </w:p>
+    <w:p>
+      <w:pPr>
+        <w:spacing w:after="60"/>
+      </w:pPr>
+      <w:r>
+        <w:t>- Automated tests cover the baseline health path and one chaos recovery path.</w:t>
+      </w:r>
+    </w:p>
+    <w:p>
+      <w:pPr>
+        <w:spacing w:after="60"/>
+      </w:pPr>
+      <w:r>
+        <w:t>- README, AGENTS.md, DOCX, and demo commands all describe the same architecture.</w:t>
+      </w:r>
+    </w:p>
+    <w:p>
+      <w:pPr>
+        <w:spacing w:after="60"/>
+      </w:pPr>
+      <w:r>
+        <w:t>- Secrets stay only in .env, never in git, screenshots, README, or demo recordings.</w:t>
       </w:r>
     </w:p>
     <w:p>
@@ -2156,12 +3776,59 @@
         <w:pStyle w:val="Heading2"/>
       </w:pPr>
       <w:r>
-        <w:t>4. Solo SRE Commander Strategy</w:t>
-      </w:r>
-    </w:p>
-    <w:p>
-      <w:r>
-        <w:t>Since we are executing this project solo, we are combining the 4 original hackathon roles into one unified engineering role: the Solo SRE Commander. This demonstrates end-to-end capabilities: writing Flask APIs, configuring Prometheus monitoring, building auto-healing daemons, designing UI interfaces, and orchestrating everything with Docker Compose.</w:t>
+        <w:rPr>
+          <w:rFonts w:ascii="Calibri" w:hAnsi="Calibri"/>
+          <w:color w:val="2E74B5"/>
+        </w:rPr>
+        <w:t>Recommended Next Work Order</w:t>
+      </w:r>
+    </w:p>
+    <w:p>
+      <w:pPr>
+        <w:spacing w:after="60"/>
+      </w:pPr>
+      <w:r>
+        <w:t>1. Fix documentation drift first: decide whether CloudMind remains a Flask simulation demo or becomes the FastAPI/Postgres/Redis system originally described.</w:t>
+      </w:r>
+    </w:p>
+    <w:p>
+      <w:pPr>
+        <w:spacing w:after="60"/>
+      </w:pPr>
+      <w:r>
+        <w:t>2. Add endpoint/test consistency: /load, /incident, shared status schema, and endpoint smoke tests.</w:t>
+      </w:r>
+    </w:p>
+    <w:p>
+      <w:pPr>
+        <w:spacing w:after="60"/>
+      </w:pPr>
+      <w:r>
+        <w:t>3. Make Gemini integration verifiable: log API failure reasons safely and add a fallback success indicator.</w:t>
+      </w:r>
+    </w:p>
+    <w:p>
+      <w:pPr>
+        <w:spacing w:after="60"/>
+      </w:pPr>
+      <w:r>
+        <w:t>4. Add run_demo.sh and an integration test script so the demo is repeatable.</w:t>
+      </w:r>
+    </w:p>
+    <w:p>
+      <w:pPr>
+        <w:spacing w:after="60"/>
+      </w:pPr>
+      <w:r>
+        <w:t>5. Then decide whether to build the React/WebSocket frontend or keep the current Flask dashboard and polish it.</w:t>
+      </w:r>
+    </w:p>
+    <w:p>
+      <w:pPr>
+        <w:spacing w:after="60"/>
+      </w:pPr>
+      <w:r>
+        <w:t>6. Only after the local demo is testable should we add CI/CD and Minikube/AWS deployment.</w:t>
       </w:r>
     </w:p>
     <w:sectPr>
@@ -2175,7 +3842,7 @@
 </file>
 
 <file path=word/numbering.xml><?xml version="1.0" encoding="utf-8"?>
-<w:numbering xmlns:wpc="http://schemas.microsoft.com/office/word/2010/wordprocessingCanvas" xmlns:cx="http://schemas.microsoft.com/office/drawing/2014/chartex" xmlns:cx1="http://schemas.microsoft.com/office/drawing/2015/9/8/chartex" xmlns:cx2="http://schemas.microsoft.com/office/drawing/2015/10/21/chartex" xmlns:cx3="http://schemas.microsoft.com/office/drawing/2016/5/9/chartex" xmlns:cx4="http://schemas.microsoft.com/office/drawing/2016/5/10/chartex" xmlns:cx5="http://schemas.microsoft.com/office/drawing/2016/5/11/chartex" xmlns:cx6="http://schemas.microsoft.com/office/drawing/2016/5/12/chartex" xmlns:cx7="http://schemas.microsoft.com/office/drawing/2016/5/13/chartex" xmlns:cx8="http://schemas.microsoft.com/office/drawing/2016/5/14/chartex" xmlns:mc="http://schemas.openxmlformats.org/markup-compatibility/2006" xmlns:aink="http://schemas.microsoft.com/office/drawing/2016/ink" xmlns:am3d="http://schemas.microsoft.com/office/drawing/2017/model3d" xmlns:o="urn:schemas-microsoft-com:office:office" xmlns:oel="http://schemas.microsoft.com/office/2019/extlst" xmlns:r="http://schemas.openxmlformats.org/officeDocument/2006/relationships" xmlns:m="http://schemas.openxmlformats.org/officeDocument/2006/math" xmlns:v="urn:schemas-microsoft-com:vml" xmlns:wp14="http://schemas.microsoft.com/office/word/2010/wordprocessingDrawing" xmlns:wp="http://schemas.openxmlformats.org/drawingml/2006/wordprocessingDrawing" xmlns:w10="urn:schemas-microsoft-com:office:word" xmlns:w="http://schemas.openxmlformats.org/wordprocessingml/2006/main" xmlns:w14="http://schemas.microsoft.com/office/word/2010/wordml" xmlns:w15="http://schemas.microsoft.com/office/word/2012/wordml" xmlns:w16cex="http://schemas.microsoft.com/office/word/2018/wordml/cex" xmlns:w16cid="http://schemas.microsoft.com/office/word/2016/wordml/cid" xmlns:w16="http://schemas.microsoft.com/office/word/2018/wordml" xmlns:w16du="http://schemas.microsoft.com/office/word/2023/wordml/word16du" xmlns:w16sdtdh="http://schemas.microsoft.com/office/word/2020/wordml/sdtdatahash" xmlns:w16se="http://schemas.microsoft.com/office/word/2015/wordml/symex" xmlns:wpg="http://schemas.microsoft.com/office/word/2010/wordprocessingGroup" xmlns:wpi="http://schemas.microsoft.com/office/word/2010/wordprocessingInk" xmlns:wne="http://schemas.microsoft.com/office/word/2006/wordml" xmlns:wps="http://schemas.microsoft.com/office/word/2010/wordprocessingShape" mc:Ignorable="w14 w15 w16se w16cid w16 w16cex w16sdtdh w16du wp14">
+<w:numbering xmlns:wpc="http://schemas.microsoft.com/office/word/2010/wordprocessingCanvas" xmlns:cx="http://schemas.microsoft.com/office/drawing/2014/chartex" xmlns:cx1="http://schemas.microsoft.com/office/drawing/2015/9/8/chartex" xmlns:cx2="http://schemas.microsoft.com/office/drawing/2015/10/21/chartex" xmlns:cx3="http://schemas.microsoft.com/office/drawing/2016/5/9/chartex" xmlns:cx4="http://schemas.microsoft.com/office/drawing/2016/5/10/chartex" xmlns:cx5="http://schemas.microsoft.com/office/drawing/2016/5/11/chartex" xmlns:cx6="http://schemas.microsoft.com/office/drawing/2016/5/12/chartex" xmlns:cx7="http://schemas.microsoft.com/office/drawing/2016/5/13/chartex" xmlns:cx8="http://schemas.microsoft.com/office/drawing/2016/5/14/chartex" xmlns:mc="http://schemas.openxmlformats.org/markup-compatibility/2006" xmlns:aink="http://schemas.microsoft.com/office/drawing/2016/ink" xmlns:am3d="http://schemas.microsoft.com/office/drawing/2017/model3d" xmlns:o="urn:schemas-microsoft-com:office:office" xmlns:oel="http://schemas.microsoft.com/office/2019/extlst" xmlns:r="http://schemas.openxmlformats.org/officeDocument/2006/relationships" xmlns:m="http://schemas.openxmlformats.org/officeDocument/2006/math" xmlns:v="urn:schemas-microsoft-com:vml" xmlns:wp14="http://schemas.microsoft.com/office/word/2010/wordprocessingDrawing" xmlns:wp="http://schemas.openxmlformats.org/drawingml/2006/wordprocessingDrawing" xmlns:w10="urn:schemas-microsoft-com:office:word" xmlns:w="http://schemas.openxmlformats.org/wordprocessingml/2006/main" xmlns:w14="http://schemas.microsoft.com/office/word/2010/wordml" xmlns:w15="http://schemas.microsoft.com/office/word/2012/wordml" xmlns:w16cex="http://schemas.microsoft.com/office/word/2018/wordml/cex" xmlns:w16cid="http://schemas.microsoft.com/office/word/2016/wordml/cid" xmlns:w16="http://schemas.microsoft.com/office/word/2018/wordml" xmlns:w16du="http://schemas.microsoft.com/office/word/2023/wordml/word16du" xmlns:w16sdtdh="http://schemas.microsoft.com/office/word/2020/wordml/sdtdatahash" xmlns:w16sdtfl="http://schemas.microsoft.com/office/word/2024/wordml/sdtformatlock" xmlns:w16se="http://schemas.microsoft.com/office/word/2015/wordml/symex" xmlns:wpg="http://schemas.microsoft.com/office/word/2010/wordprocessingGroup" xmlns:wpi="http://schemas.microsoft.com/office/word/2010/wordprocessingInk" xmlns:wne="http://schemas.microsoft.com/office/word/2006/wordml" xmlns:wps="http://schemas.microsoft.com/office/word/2010/wordprocessingShape" mc:Ignorable="w14 w15 w16se w16cid w16 w16cex w16sdtdh w16sdtfl w16du wp14">
   <w:abstractNum w:abstractNumId="0" w15:restartNumberingAfterBreak="0">
     <w:nsid w:val="068F50E0"/>
     <w:multiLevelType w:val="multilevel"/>
@@ -2940,7 +4607,7 @@
 </file>
 
 <file path=word/styles.xml><?xml version="1.0" encoding="utf-8"?>
-<w:styles xmlns:mc="http://schemas.openxmlformats.org/markup-compatibility/2006" xmlns:r="http://schemas.openxmlformats.org/officeDocument/2006/relationships" xmlns:w="http://schemas.openxmlformats.org/wordprocessingml/2006/main" xmlns:w14="http://schemas.microsoft.com/office/word/2010/wordml" xmlns:w15="http://schemas.microsoft.com/office/word/2012/wordml" xmlns:w16cex="http://schemas.microsoft.com/office/word/2018/wordml/cex" xmlns:w16cid="http://schemas.microsoft.com/office/word/2016/wordml/cid" xmlns:w16="http://schemas.microsoft.com/office/word/2018/wordml" xmlns:w16du="http://schemas.microsoft.com/office/word/2023/wordml/word16du" xmlns:w16sdtdh="http://schemas.microsoft.com/office/word/2020/wordml/sdtdatahash" xmlns:w16se="http://schemas.microsoft.com/office/word/2015/wordml/symex" mc:Ignorable="w14 w15 w16se w16cid w16 w16cex w16sdtdh w16du">
+<w:styles xmlns:mc="http://schemas.openxmlformats.org/markup-compatibility/2006" xmlns:r="http://schemas.openxmlformats.org/officeDocument/2006/relationships" xmlns:w="http://schemas.openxmlformats.org/wordprocessingml/2006/main" xmlns:w14="http://schemas.microsoft.com/office/word/2010/wordml" xmlns:w15="http://schemas.microsoft.com/office/word/2012/wordml" xmlns:w16cex="http://schemas.microsoft.com/office/word/2018/wordml/cex" xmlns:w16cid="http://schemas.microsoft.com/office/word/2016/wordml/cid" xmlns:w16="http://schemas.microsoft.com/office/word/2018/wordml" xmlns:w16du="http://schemas.microsoft.com/office/word/2023/wordml/word16du" xmlns:w16sdtdh="http://schemas.microsoft.com/office/word/2020/wordml/sdtdatahash" xmlns:w16sdtfl="http://schemas.microsoft.com/office/word/2024/wordml/sdtformatlock" xmlns:w16se="http://schemas.microsoft.com/office/word/2015/wordml/symex" mc:Ignorable="w14 w15 w16se w16cid w16 w16cex w16sdtdh w16sdtfl w16du">
   <w:docDefaults>
     <w:rPrDefault>
       <w:rPr>

</xml_diff>